<commit_message>
feat: refine interview demos and remove template styling
</commit_message>
<xml_diff>
--- a/demo/后端/samples/主文档.docx
+++ b/demo/后端/samples/主文档.docx
@@ -8,7 +8,7 @@
         <w:jc w:val="center"/>
       </w:pPr>
       <w:r>
-        <w:t>OpenHarness 交付文档</w:t>
+        <w:t>设备检测项目交付文档</w:t>
       </w:r>
     </w:p>
     <w:p>
@@ -20,12 +20,12 @@
           <w:color w:val="5B6474"/>
           <w:sz w:val="20"/>
         </w:rPr>
-        <w:t>主文档 + 副文档自动合并示例</w:t>
+        <w:t>主文档与副文档合并示例</w:t>
       </w:r>
     </w:p>
     <w:p>
       <w:r>
-        <w:t>本文档由主文档和多个副文档自动合并生成。目录、标题编号与页码可在 Word 中按 F9 更新。</w:t>
+        <w:t>本文档汇总设备检测项目的检测范围、实施安排和结果说明。目录与页码可在 Word 中更新。</w:t>
       </w:r>
     </w:p>
     <w:p>
@@ -43,7 +43,7 @@
     </w:p>
     <w:p>
       <w:r>
-        <w:t>OpenHarness 是一套面向研发团队的智能体编排平台。本交付文档汇总产品能力与实施计划，用于演示按标记提取副文档内容并合并到主文档的完整流程。</w:t>
+        <w:t>本项目对生产车间内的电气与暖通设备开展例行检测，重点记录运行参数、异常情况和处理建议。项目交付内容包括检测范围、现场计划、原始记录和最终报告。</w:t>
       </w:r>
     </w:p>
     <w:p>
@@ -51,7 +51,7 @@
         <w:pStyle w:val="ListBullet"/>
       </w:pPr>
       <w:r>
-        <w:t>主文档提供封面、目录、总体说明与附录。</w:t>
+        <w:t>主文档包含项目概述、目录和附录。</w:t>
       </w:r>
     </w:p>
     <w:p>
@@ -59,7 +59,7 @@
         <w:pStyle w:val="ListBullet"/>
       </w:pPr>
       <w:r>
-        <w:t>副文档只贡献被 tag-start / tag-end 标记包裹的内容。</w:t>
+        <w:t>副文档提供检测范围与实施安排。</w:t>
       </w:r>
     </w:p>
     <w:p>
@@ -67,7 +67,7 @@
         <w:pStyle w:val="ListBullet"/>
       </w:pPr>
       <w:r>
-        <w:t>合并结果保留原有段落、表格、图片与样式。</w:t>
+        <w:t>合并结果保留原文档中的段落、表格、图片和样式。</w:t>
       </w:r>
     </w:p>
     <w:p>
@@ -85,7 +85,7 @@
     </w:p>
     <w:p>
       <w:r>
-        <w:t>在 Word 中打开合并结果后，按 Ctrl+A 再按 F9 即可刷新目录页码。如果希望重新生成，请回到上传页面替换文件后再次合并。</w:t>
+        <w:t>在 Word 中打开合并结果后，按 Ctrl+A 再按 F9 即可刷新目录页码。如需重新生成，请返回上传页面替换文件后再次合并。</w:t>
       </w:r>
     </w:p>
     <w:sectPr>
@@ -528,7 +528,7 @@
       <w:rFonts w:asciiTheme="majorHAnsi" w:eastAsiaTheme="majorEastAsia" w:hAnsiTheme="majorHAnsi" w:cstheme="majorBidi" w:ascii="微软雅黑" w:hAnsi="微软雅黑" w:eastAsia="微软雅黑"/>
       <w:b/>
       <w:bCs/>
-      <w:color w:val="1C46AD"/>
+      <w:color w:val="17466F"/>
       <w:sz w:val="28"/>
       <w:szCs w:val="28"/>
     </w:rPr>
@@ -552,7 +552,7 @@
       <w:rFonts w:asciiTheme="majorHAnsi" w:eastAsiaTheme="majorEastAsia" w:hAnsiTheme="majorHAnsi" w:cstheme="majorBidi" w:ascii="微软雅黑" w:hAnsi="微软雅黑" w:eastAsia="微软雅黑"/>
       <w:b/>
       <w:bCs/>
-      <w:color w:val="1C46AD"/>
+      <w:color w:val="17466F"/>
       <w:sz w:val="26"/>
       <w:szCs w:val="26"/>
     </w:rPr>
@@ -576,7 +576,7 @@
       <w:rFonts w:asciiTheme="majorHAnsi" w:eastAsiaTheme="majorEastAsia" w:hAnsiTheme="majorHAnsi" w:cstheme="majorBidi" w:ascii="微软雅黑" w:hAnsi="微软雅黑" w:eastAsia="微软雅黑"/>
       <w:b/>
       <w:bCs/>
-      <w:color w:val="1C46AD"/>
+      <w:color w:val="17466F"/>
     </w:rPr>
   </w:style>
   <w:style w:type="paragraph" w:styleId="Heading4">
@@ -815,7 +815,7 @@
     </w:pPr>
     <w:rPr>
       <w:rFonts w:asciiTheme="majorHAnsi" w:eastAsiaTheme="majorEastAsia" w:hAnsiTheme="majorHAnsi" w:cstheme="majorBidi" w:ascii="微软雅黑" w:hAnsi="微软雅黑" w:eastAsia="微软雅黑"/>
-      <w:color w:val="2457D8"/>
+      <w:color w:val="1F5B99"/>
       <w:spacing w:val="5"/>
       <w:kern w:val="28"/>
       <w:sz w:val="52"/>

</xml_diff>

<commit_message>
refactor: remove template-style demo content
</commit_message>
<xml_diff>
--- a/demo/后端/samples/主文档.docx
+++ b/demo/后端/samples/主文档.docx
@@ -8,26 +8,214 @@
         <w:jc w:val="center"/>
       </w:pPr>
       <w:r>
-        <w:t>设备检测项目交付文档</w:t>
+        <w:t>一号车间设备检测报告</w:t>
       </w:r>
     </w:p>
-    <w:p>
-      <w:pPr>
+    <w:tbl>
+      <w:tblPr>
+        <w:tblStyle w:val="TableGrid"/>
+        <w:tblW w:type="auto" w:w="0"/>
         <w:jc w:val="center"/>
-      </w:pPr>
-      <w:r>
-        <w:rPr>
-          <w:color w:val="5B6474"/>
-          <w:sz w:val="20"/>
-        </w:rPr>
-        <w:t>主文档与副文档合并示例</w:t>
-      </w:r>
-    </w:p>
-    <w:p>
-      <w:r>
-        <w:t>本文档汇总设备检测项目的检测范围、实施安排和结果说明。目录与页码可在 Word 中更新。</w:t>
-      </w:r>
-    </w:p>
+        <w:tblLook w:firstColumn="1" w:firstRow="1" w:lastColumn="0" w:lastRow="0" w:noHBand="0" w:noVBand="1" w:val="04A0"/>
+      </w:tblPr>
+      <w:tblGrid>
+        <w:gridCol w:w="2160"/>
+        <w:gridCol w:w="2160"/>
+        <w:gridCol w:w="2160"/>
+        <w:gridCol w:w="2160"/>
+      </w:tblGrid>
+      <w:tr>
+        <w:tc>
+          <w:tcPr>
+            <w:tcW w:type="dxa" w:w="2160"/>
+            <w:shd w:fill="D9E2F3"/>
+          </w:tcPr>
+          <w:p>
+            <w:r/>
+            <w:r>
+              <w:rPr>
+                <w:b/>
+                <w:sz w:val="18"/>
+              </w:rPr>
+              <w:t>受检单位</w:t>
+            </w:r>
+          </w:p>
+        </w:tc>
+        <w:tc>
+          <w:tcPr>
+            <w:tcW w:type="dxa" w:w="2160"/>
+            <w:shd w:fill="D9E2F3"/>
+          </w:tcPr>
+          <w:p>
+            <w:r/>
+            <w:r>
+              <w:rPr>
+                <w:b/>
+                <w:sz w:val="18"/>
+              </w:rPr>
+              <w:t>生产保障部</w:t>
+            </w:r>
+          </w:p>
+        </w:tc>
+        <w:tc>
+          <w:tcPr>
+            <w:tcW w:type="dxa" w:w="2160"/>
+            <w:shd w:fill="D9E2F3"/>
+          </w:tcPr>
+          <w:p>
+            <w:r/>
+            <w:r>
+              <w:rPr>
+                <w:b/>
+                <w:sz w:val="18"/>
+              </w:rPr>
+              <w:t>检测日期</w:t>
+            </w:r>
+          </w:p>
+        </w:tc>
+        <w:tc>
+          <w:tcPr>
+            <w:tcW w:type="dxa" w:w="2160"/>
+            <w:shd w:fill="D9E2F3"/>
+          </w:tcPr>
+          <w:p>
+            <w:r/>
+            <w:r>
+              <w:rPr>
+                <w:b/>
+                <w:sz w:val="18"/>
+              </w:rPr>
+              <w:t>2026-10-19 至 2026-10-21</w:t>
+            </w:r>
+          </w:p>
+        </w:tc>
+      </w:tr>
+      <w:tr>
+        <w:tc>
+          <w:tcPr>
+            <w:tcW w:type="dxa" w:w="2160"/>
+          </w:tcPr>
+          <w:p>
+            <w:r/>
+            <w:r>
+              <w:rPr>
+                <w:b w:val="0"/>
+                <w:sz w:val="18"/>
+              </w:rPr>
+              <w:t>编制</w:t>
+            </w:r>
+          </w:p>
+        </w:tc>
+        <w:tc>
+          <w:tcPr>
+            <w:tcW w:type="dxa" w:w="2160"/>
+          </w:tcPr>
+          <w:p>
+            <w:r/>
+            <w:r>
+              <w:rPr>
+                <w:b w:val="0"/>
+                <w:sz w:val="18"/>
+              </w:rPr>
+              <w:t>张明</w:t>
+            </w:r>
+          </w:p>
+        </w:tc>
+        <w:tc>
+          <w:tcPr>
+            <w:tcW w:type="dxa" w:w="2160"/>
+          </w:tcPr>
+          <w:p>
+            <w:r/>
+            <w:r>
+              <w:rPr>
+                <w:b w:val="0"/>
+                <w:sz w:val="18"/>
+              </w:rPr>
+              <w:t>审核</w:t>
+            </w:r>
+          </w:p>
+        </w:tc>
+        <w:tc>
+          <w:tcPr>
+            <w:tcW w:type="dxa" w:w="2160"/>
+          </w:tcPr>
+          <w:p>
+            <w:r/>
+            <w:r>
+              <w:rPr>
+                <w:b w:val="0"/>
+                <w:sz w:val="18"/>
+              </w:rPr>
+              <w:t>李工</w:t>
+            </w:r>
+          </w:p>
+        </w:tc>
+      </w:tr>
+      <w:tr>
+        <w:tc>
+          <w:tcPr>
+            <w:tcW w:type="dxa" w:w="2160"/>
+          </w:tcPr>
+          <w:p>
+            <w:r/>
+            <w:r>
+              <w:rPr>
+                <w:b w:val="0"/>
+                <w:sz w:val="18"/>
+              </w:rPr>
+              <w:t>检测地点</w:t>
+            </w:r>
+          </w:p>
+        </w:tc>
+        <w:tc>
+          <w:tcPr>
+            <w:tcW w:type="dxa" w:w="2160"/>
+          </w:tcPr>
+          <w:p>
+            <w:r/>
+            <w:r>
+              <w:rPr>
+                <w:b w:val="0"/>
+                <w:sz w:val="18"/>
+              </w:rPr>
+              <w:t>一号车间</w:t>
+            </w:r>
+          </w:p>
+        </w:tc>
+        <w:tc>
+          <w:tcPr>
+            <w:tcW w:type="dxa" w:w="2160"/>
+          </w:tcPr>
+          <w:p>
+            <w:r/>
+            <w:r>
+              <w:rPr>
+                <w:b w:val="0"/>
+                <w:sz w:val="18"/>
+              </w:rPr>
+              <w:t>记录人</w:t>
+            </w:r>
+          </w:p>
+        </w:tc>
+        <w:tc>
+          <w:tcPr>
+            <w:tcW w:type="dxa" w:w="2160"/>
+          </w:tcPr>
+          <w:p>
+            <w:r/>
+            <w:r>
+              <w:rPr>
+                <w:b w:val="0"/>
+                <w:sz w:val="18"/>
+              </w:rPr>
+              <w:t>王磊</w:t>
+            </w:r>
+          </w:p>
+        </w:tc>
+      </w:tr>
+    </w:tbl>
+    <w:p/>
     <w:p>
       <w:r>
         <w:t>${toc}</w:t>
@@ -38,12 +226,17 @@
         <w:pStyle w:val="Heading1"/>
       </w:pPr>
       <w:r>
-        <w:t>项目概述</w:t>
+        <w:t>检测概况</w:t>
       </w:r>
     </w:p>
     <w:p>
       <w:r>
-        <w:t>本项目对生产车间内的电气与暖通设备开展例行检测，重点记录运行参数、异常情况和处理建议。项目交付内容包括检测范围、现场计划、原始记录和最终报告。</w:t>
+        <w:t>本次检测对象为一号车间东侧的配电柜、控制柜、循环风机和空调机组。检测安排在交接班期间进行，现场设备按作业票要求停电或切换至安全状态。</w:t>
+      </w:r>
+    </w:p>
+    <w:p>
+      <w:r>
+        <w:t>报告中的运行参数来自现场仪表读数和设备自带显示值。原始记录由检测人和复核人签字，报告结论仅对本次受检设备有效。</w:t>
       </w:r>
     </w:p>
     <w:p>
@@ -51,7 +244,7 @@
         <w:pStyle w:val="ListBullet"/>
       </w:pPr>
       <w:r>
-        <w:t>主文档包含项目概述、目录和附录。</w:t>
+        <w:t>检测依据：设备说明书、作业许可单和公司例行巡检规定。</w:t>
       </w:r>
     </w:p>
     <w:p>
@@ -59,7 +252,7 @@
         <w:pStyle w:val="ListBullet"/>
       </w:pPr>
       <w:r>
-        <w:t>副文档提供检测范围与实施安排。</w:t>
+        <w:t>检测内容：外观、运行参数、保护功能及异常项复核。</w:t>
       </w:r>
     </w:p>
     <w:p>
@@ -67,7 +260,7 @@
         <w:pStyle w:val="ListBullet"/>
       </w:pPr>
       <w:r>
-        <w:t>合并结果保留原文档中的段落、表格、图片和样式。</w:t>
+        <w:t>记录方式：现场填写原始记录表，异常位置补充照片。</w:t>
       </w:r>
     </w:p>
     <w:p>
@@ -80,12 +273,17 @@
         <w:pStyle w:val="Heading1"/>
       </w:pPr>
       <w:r>
-        <w:t>附录：使用说明</w:t>
+        <w:t>附录：记录说明</w:t>
       </w:r>
     </w:p>
     <w:p>
       <w:r>
-        <w:t>在 Word 中打开合并结果后，按 Ctrl+A 再按 F9 即可刷新目录页码。如需重新生成，请返回上传页面替换文件后再次合并。</w:t>
+        <w:t>原始记录和现场照片存放在一号车间资料柜，复核时按设备名称查找。报告内容需要调整时，替换副文档后重新合并即可。</w:t>
+      </w:r>
+    </w:p>
+    <w:p>
+      <w:r>
+        <w:t>合并完成后，目录页码需要在 Word 中按 Ctrl+A、F9 更新。</w:t>
       </w:r>
     </w:p>
     <w:sectPr>
@@ -461,8 +659,11 @@
     <w:name w:val="Normal"/>
     <w:qFormat/>
     <w:rsid w:val="00FC693F"/>
+    <w:pPr>
+      <w:spacing w:after="120" w:line="324" w:lineRule="auto"/>
+    </w:pPr>
     <w:rPr>
-      <w:rFonts w:ascii="微软雅黑" w:hAnsi="微软雅黑" w:eastAsia="微软雅黑"/>
+      <w:rFonts w:ascii="宋体" w:hAnsi="宋体" w:eastAsia="宋体"/>
       <w:sz w:val="21"/>
     </w:rPr>
   </w:style>
@@ -525,10 +726,9 @@
       <w:outlineLvl w:val="0"/>
     </w:pPr>
     <w:rPr>
-      <w:rFonts w:asciiTheme="majorHAnsi" w:eastAsiaTheme="majorEastAsia" w:hAnsiTheme="majorHAnsi" w:cstheme="majorBidi" w:ascii="微软雅黑" w:hAnsi="微软雅黑" w:eastAsia="微软雅黑"/>
+      <w:rFonts w:asciiTheme="majorHAnsi" w:eastAsiaTheme="majorEastAsia" w:hAnsiTheme="majorHAnsi" w:cstheme="majorBidi" w:ascii="黑体" w:hAnsi="黑体" w:eastAsia="黑体"/>
       <w:b/>
       <w:bCs/>
-      <w:color w:val="17466F"/>
       <w:sz w:val="28"/>
       <w:szCs w:val="28"/>
     </w:rPr>
@@ -549,11 +749,10 @@
       <w:outlineLvl w:val="1"/>
     </w:pPr>
     <w:rPr>
-      <w:rFonts w:asciiTheme="majorHAnsi" w:eastAsiaTheme="majorEastAsia" w:hAnsiTheme="majorHAnsi" w:cstheme="majorBidi" w:ascii="微软雅黑" w:hAnsi="微软雅黑" w:eastAsia="微软雅黑"/>
+      <w:rFonts w:asciiTheme="majorHAnsi" w:eastAsiaTheme="majorEastAsia" w:hAnsiTheme="majorHAnsi" w:cstheme="majorBidi" w:ascii="黑体" w:hAnsi="黑体" w:eastAsia="黑体"/>
       <w:b/>
       <w:bCs/>
-      <w:color w:val="17466F"/>
-      <w:sz w:val="26"/>
+      <w:sz w:val="28"/>
       <w:szCs w:val="26"/>
     </w:rPr>
   </w:style>
@@ -573,10 +772,10 @@
       <w:outlineLvl w:val="2"/>
     </w:pPr>
     <w:rPr>
-      <w:rFonts w:asciiTheme="majorHAnsi" w:eastAsiaTheme="majorEastAsia" w:hAnsiTheme="majorHAnsi" w:cstheme="majorBidi" w:ascii="微软雅黑" w:hAnsi="微软雅黑" w:eastAsia="微软雅黑"/>
+      <w:rFonts w:asciiTheme="majorHAnsi" w:eastAsiaTheme="majorEastAsia" w:hAnsiTheme="majorHAnsi" w:cstheme="majorBidi" w:ascii="黑体" w:hAnsi="黑体" w:eastAsia="黑体"/>
       <w:b/>
       <w:bCs/>
-      <w:color w:val="17466F"/>
+      <w:sz w:val="28"/>
     </w:rPr>
   </w:style>
   <w:style w:type="paragraph" w:styleId="Heading4">
@@ -814,11 +1013,10 @@
       <w:contextualSpacing/>
     </w:pPr>
     <w:rPr>
-      <w:rFonts w:asciiTheme="majorHAnsi" w:eastAsiaTheme="majorEastAsia" w:hAnsiTheme="majorHAnsi" w:cstheme="majorBidi" w:ascii="微软雅黑" w:hAnsi="微软雅黑" w:eastAsia="微软雅黑"/>
-      <w:color w:val="1F5B99"/>
+      <w:rFonts w:asciiTheme="majorHAnsi" w:eastAsiaTheme="majorEastAsia" w:hAnsiTheme="majorHAnsi" w:cstheme="majorBidi" w:ascii="黑体" w:hAnsi="黑体" w:eastAsia="黑体"/>
       <w:spacing w:val="5"/>
       <w:kern w:val="28"/>
-      <w:sz w:val="52"/>
+      <w:sz w:val="36"/>
       <w:szCs w:val="52"/>
     </w:rPr>
   </w:style>

</xml_diff>